<commit_message>
Add web version as Option 1 in Word installation guide
Quick Start section now leads with the no-install web version and
home screen tips, followed by Expo Go as Option 2.

Co-Authored-By: Claude Sonnet 4.6 <noreply@anthropic.com>
</commit_message>
<xml_diff>
--- a/VSS_2026_Installation_Instructions.docx
+++ b/VSS_2026_Installation_Instructions.docx
@@ -179,7 +179,10 @@
         <w:pStyle w:val="Heading2"/>
       </w:pPr>
       <w:r>
-        <w:t xml:space="preserve">For the Impatient (5 Minutes to Working App)</w:t>
+        <w:rPr>
+          <w:b/>
+        </w:rPr>
+        <w:t>Two ways to use it — choose whichever is easier:</w:t>
       </w:r>
     </w:p>
     <w:p>
@@ -187,7 +190,9 @@
         <w:spacing w:after="120"/>
       </w:pPr>
       <w:r>
-        <w:t xml:space="preserve">Step 1: Install Expo Go app on your phone (iPhone App Store or Google Play Store)</w:t>
+        <w:rPr>
+          <w:b w:val="0"/>
+        </w:rPr>
       </w:r>
     </w:p>
     <w:p>
@@ -195,7 +200,10 @@
         <w:spacing w:after="80"/>
       </w:pPr>
       <w:r>
-        <w:t xml:space="preserve">Step 2: On your computer:</w:t>
+        <w:rPr>
+          <w:b/>
+        </w:rPr>
+        <w:t>Option 1: Web version (simplest — no installation required)</w:t>
       </w:r>
     </w:p>
     <w:p>
@@ -204,11 +212,11 @@
       </w:pPr>
       <w:r>
         <w:rPr>
+          <w:b w:val="0"/>
           <w:color w:val="C65911"/>
           <w:sz w:val="20"/>
           <w:szCs w:val="20"/>
         </w:rPr>
-        <w:t xml:space="preserve">cd ~/vss-mobile</w:t>
       </w:r>
     </w:p>
     <w:p>
@@ -217,11 +225,12 @@
       </w:pPr>
       <w:r>
         <w:rPr>
+          <w:b w:val="0"/>
           <w:color w:val="C65911"/>
           <w:sz w:val="20"/>
           <w:szCs w:val="20"/>
         </w:rPr>
-        <w:t xml:space="preserve">npm install</w:t>
+        <w:t>Open in any phone browser: https://markwgreenlee.github.io/vss-2026-scheduler</w:t>
       </w:r>
     </w:p>
     <w:p>
@@ -230,11 +239,12 @@
       </w:pPr>
       <w:r>
         <w:rPr>
+          <w:b w:val="0"/>
           <w:color w:val="C65911"/>
           <w:sz w:val="20"/>
           <w:szCs w:val="20"/>
         </w:rPr>
-        <w:t xml:space="preserve">npm start</w:t>
+        <w:t>Or scan the web QR code in the attached guide. Works on any iPhone or Android — no app, no account, no setup. Google Calendar export works; Apple Calendar export requires Option 2.</w:t>
       </w:r>
     </w:p>
     <w:p>
@@ -242,16 +252,18 @@
         <w:spacing w:after="120"/>
       </w:pPr>
       <w:r>
-        <w:t xml:space="preserve">Step 3: In Expo Go, scan the QR code from the terminal</w:t>
-      </w:r>
-    </w:p>
-    <w:p>
-      <w:r>
-        <w:rPr>
-          <w:b/>
+        <w:rPr>
+          <w:b w:val="0"/>
+        </w:rPr>
+      </w:r>
+    </w:p>
+    <w:p>
+      <w:r>
+        <w:rPr>
+          <w:b w:val="0"/>
           <w:bCs/>
         </w:rPr>
-        <w:t xml:space="preserve">That's it! Your app is ready.</w:t>
+        <w:t>Optional — add to your home screen for quick access:</w:t>
       </w:r>
     </w:p>
     <w:p>
@@ -260,10 +272,70 @@
       </w:pPr>
       <w:r>
         <w:rPr>
+          <w:b w:val="0"/>
           <w:i/>
           <w:iCs/>
         </w:rPr>
-        <w:t xml:space="preserve">Important: No Expo account needed for this method—it's a direct local connection.</w:t>
+        <w:t>iPhone (Safari): tap the Share button → Add to Home Screen</w:t>
+      </w:r>
+    </w:p>
+    <w:p>
+      <w:r>
+        <w:rPr>
+          <w:b w:val="0"/>
+        </w:rPr>
+        <w:t>iPhone (Chrome): tap the three-dot menu → Add to Home Screen</w:t>
+      </w:r>
+    </w:p>
+    <w:p>
+      <w:r>
+        <w:rPr>
+          <w:b w:val="0"/>
+        </w:rPr>
+        <w:t>Android (Chrome): tap the three-dot menu → Add to Home Screen</w:t>
+      </w:r>
+    </w:p>
+    <w:p/>
+    <w:p>
+      <w:r>
+        <w:rPr>
+          <w:b/>
+        </w:rPr>
+        <w:t>Option 2: Expo Go app (full features including Apple Calendar)</w:t>
+      </w:r>
+    </w:p>
+    <w:p/>
+    <w:p>
+      <w:r>
+        <w:rPr>
+          <w:b w:val="0"/>
+        </w:rPr>
+        <w:t>Step 1: Install the free Expo Go app from the App Store (iPhone) or Google Play Store (Android). No need to open it.</w:t>
+      </w:r>
+    </w:p>
+    <w:p>
+      <w:r>
+        <w:rPr>
+          <w:b w:val="0"/>
+        </w:rPr>
+        <w:t>Step 2: Open the Camera app and point it at the QR code in the attached guide</w:t>
+      </w:r>
+    </w:p>
+    <w:p>
+      <w:r>
+        <w:rPr>
+          <w:b w:val="0"/>
+        </w:rPr>
+        <w:t>Step 3: Tap the notification that appears — the app opens in Expo Go automatically</w:t>
+      </w:r>
+    </w:p>
+    <w:p/>
+    <w:p>
+      <w:r>
+        <w:rPr>
+          <w:b w:val="0"/>
+        </w:rPr>
+        <w:t>No login needed: If Expo Go asks you to log in, skip it — just use your phone's camera to scan the QR code directly.</w:t>
       </w:r>
     </w:p>
     <w:p>

</xml_diff>

<commit_message>
Remove Expo Go from installation guide Word doc
Expo policy change (May 12, 2026) makes Expo Go distribution impossible
for general audiences. Web version is now the sole recommended method.

Co-Authored-By: Claude Sonnet 4.6 <noreply@anthropic.com>
</commit_message>
<xml_diff>
--- a/VSS_2026_Installation_Instructions.docx
+++ b/VSS_2026_Installation_Instructions.docx
@@ -148,18 +148,18 @@
     </w:p>
     <w:p>
       <w:r>
-        <w:t xml:space="preserve">You now have a </w:t>
+        <w:rPr>
+          <w:b w:val="0"/>
+        </w:rPr>
+        <w:t>This guide explains how to access the VSS 2026 Schedule Organizer — a free web-based tool for searching and organizing your conference schedule. No installation required.</w:t>
       </w:r>
       <w:r>
         <w:rPr>
           <w:b/>
           <w:bCs/>
         </w:rPr>
-        <w:t xml:space="preserve">native iOS and Android mobile app</w:t>
-      </w:r>
-      <w:r>
-        <w:t xml:space="preserve"> ready to use for organizing your VSS 2026 conference schedule. This document provides complete step-by-step instructions for both platforms.</w:t>
-      </w:r>
+      </w:r>
+      <w:r/>
     </w:p>
     <w:p>
       <w:r>
@@ -182,7 +182,7 @@
         <w:rPr>
           <w:b/>
         </w:rPr>
-        <w:t>Two ways to use it — choose whichever is easier:</w:t>
+        <w:t>No installation required — use the web version:</w:t>
       </w:r>
     </w:p>
     <w:p>
@@ -201,9 +201,8 @@
       </w:pPr>
       <w:r>
         <w:rPr>
-          <w:b/>
-        </w:rPr>
-        <w:t>Option 1: Web version (simplest — no installation required)</w:t>
+          <w:b w:val="0"/>
+        </w:rPr>
       </w:r>
     </w:p>
     <w:p>
@@ -263,7 +262,7 @@
           <w:b w:val="0"/>
           <w:bCs/>
         </w:rPr>
-        <w:t>Optional — add to your home screen for quick access:</w:t>
+        <w:t>Tip: load the app before arriving at the venue so it is cached and works even on slow conference WiFi.</w:t>
       </w:r>
     </w:p>
     <w:p>
@@ -299,43 +298,50 @@
     <w:p>
       <w:r>
         <w:rPr>
-          <w:b/>
-        </w:rPr>
-        <w:t>Option 2: Expo Go app (full features including Apple Calendar)</w:t>
-      </w:r>
-    </w:p>
-    <w:p/>
-    <w:p>
-      <w:r>
-        <w:rPr>
-          <w:b w:val="0"/>
-        </w:rPr>
-        <w:t>Step 1: Install the free Expo Go app from the App Store (iPhone) or Google Play Store (Android). No need to open it.</w:t>
-      </w:r>
-    </w:p>
-    <w:p>
-      <w:r>
-        <w:rPr>
-          <w:b w:val="0"/>
-        </w:rPr>
-        <w:t>Step 2: Open the Camera app and point it at the QR code in the attached guide</w:t>
-      </w:r>
-    </w:p>
-    <w:p>
-      <w:r>
-        <w:rPr>
-          <w:b w:val="0"/>
-        </w:rPr>
-        <w:t>Step 3: Tap the notification that appears — the app opens in Expo Go automatically</w:t>
-      </w:r>
-    </w:p>
-    <w:p/>
-    <w:p>
-      <w:r>
-        <w:rPr>
-          <w:b w:val="0"/>
-        </w:rPr>
-        <w:t>No login needed: If Expo Go asks you to log in, skip it — just use your phone's camera to scan the QR code directly.</w:t>
+          <w:b w:val="0"/>
+        </w:rPr>
+      </w:r>
+    </w:p>
+    <w:p>
+      <w:r>
+        <w:rPr>
+          <w:b w:val="0"/>
+        </w:rPr>
+      </w:r>
+    </w:p>
+    <w:p>
+      <w:r>
+        <w:rPr>
+          <w:b w:val="0"/>
+        </w:rPr>
+      </w:r>
+    </w:p>
+    <w:p>
+      <w:r>
+        <w:rPr>
+          <w:b w:val="0"/>
+        </w:rPr>
+      </w:r>
+    </w:p>
+    <w:p>
+      <w:r>
+        <w:rPr>
+          <w:b w:val="0"/>
+        </w:rPr>
+      </w:r>
+    </w:p>
+    <w:p>
+      <w:r>
+        <w:rPr>
+          <w:b w:val="0"/>
+        </w:rPr>
+      </w:r>
+    </w:p>
+    <w:p>
+      <w:r>
+        <w:rPr>
+          <w:b w:val="0"/>
+        </w:rPr>
       </w:r>
     </w:p>
     <w:p>
@@ -378,12 +384,18 @@
         <w:pStyle w:val="Heading2"/>
       </w:pPr>
       <w:r>
-        <w:t xml:space="preserve">Method 1: Expo Go (Easiest – Recommended)</w:t>
-      </w:r>
-    </w:p>
-    <w:p>
-      <w:r>
-        <w:t xml:space="preserve">No account needed. Download Expo Go, run 'npm start' on your computer, and scan the QR code.</w:t>
+        <w:rPr>
+          <w:b w:val="0"/>
+        </w:rPr>
+        <w:t>Method 1: Web Version (Recommended)</w:t>
+      </w:r>
+    </w:p>
+    <w:p>
+      <w:r>
+        <w:rPr>
+          <w:b w:val="0"/>
+        </w:rPr>
+        <w:t>Open https://markwgreenlee.github.io/vss-2026-scheduler in any phone browser. No app or account needed. Add to home screen for quick access.</w:t>
       </w:r>
     </w:p>
     <w:p>
@@ -396,7 +408,10 @@
         <w:pStyle w:val="Heading2"/>
       </w:pPr>
       <w:r>
-        <w:t xml:space="preserve">Method 2: Build Android APK (Permanent App)</w:t>
+        <w:rPr>
+          <w:b w:val="0"/>
+        </w:rPr>
+        <w:t>Method 2: Build Android APK (Developers only)</w:t>
       </w:r>
     </w:p>
     <w:p>
@@ -547,7 +562,9 @@
         <w:pStyle w:val="Heading2"/>
       </w:pPr>
       <w:r>
-        <w:t xml:space="preserve">Error: &amp;#x201C;signed-in Expo account does not have access&amp;#x201D;</w:t>
+        <w:rPr>
+          <w:b w:val="0"/>
+        </w:rPr>
       </w:r>
     </w:p>
     <w:p>
@@ -556,14 +573,11 @@
       </w:pPr>
       <w:r>
         <w:rPr>
-          <w:b/>
+          <w:b w:val="0"/>
           <w:bCs/>
         </w:rPr>
-        <w:t xml:space="preserve">What this means:</w:t>
-      </w:r>
-      <w:r>
-        <w:t xml:space="preserve"> You happen to be signed into Expo Go with an account that isn't the project owner. Even though you don't need an account for local development, Expo Go checks account permissions when you're logged in.</w:t>
-      </w:r>
+      </w:r>
+      <w:r/>
     </w:p>
     <w:p>
       <w:pPr>
@@ -571,25 +585,30 @@
       </w:pPr>
       <w:r>
         <w:rPr>
-          <w:b/>
+          <w:b w:val="0"/>
           <w:bCs/>
         </w:rPr>
-        <w:t xml:space="preserve">The fix:</w:t>
-      </w:r>
-    </w:p>
-    <w:p>
-      <w:r>
-        <w:t xml:space="preserve">1. Sign out of Expo Go on your phone (tap profile icon → Sign out)</w:t>
-      </w:r>
-    </w:p>
-    <w:p>
-      <w:r>
-        <w:t xml:space="preserve">2. Run 'npm start' on your computer</w:t>
-      </w:r>
-    </w:p>
-    <w:p>
-      <w:r>
-        <w:t xml:space="preserve">3. Scan the QR code</w:t>
+      </w:r>
+    </w:p>
+    <w:p>
+      <w:r>
+        <w:rPr>
+          <w:b w:val="0"/>
+        </w:rPr>
+      </w:r>
+    </w:p>
+    <w:p>
+      <w:r>
+        <w:rPr>
+          <w:b w:val="0"/>
+        </w:rPr>
+      </w:r>
+    </w:p>
+    <w:p>
+      <w:r>
+        <w:rPr>
+          <w:b w:val="0"/>
+        </w:rPr>
       </w:r>
     </w:p>
     <w:p>
@@ -597,7 +616,9 @@
         <w:spacing w:after="240"/>
       </w:pPr>
       <w:r>
-        <w:t xml:space="preserve">Once signed out, Expo Go uses a simple local connection without any account verification.</w:t>
+        <w:rPr>
+          <w:b w:val="0"/>
+        </w:rPr>
       </w:r>
     </w:p>
     <w:p>
@@ -605,12 +626,18 @@
         <w:pStyle w:val="Heading2"/>
       </w:pPr>
       <w:r>
-        <w:t xml:space="preserve">App Won't Start</w:t>
-      </w:r>
-    </w:p>
-    <w:p>
-      <w:r>
-        <w:t xml:space="preserve">Force close the app, wait 10 seconds, reopen. If it still fails, restart your phone.</w:t>
+        <w:rPr>
+          <w:b w:val="0"/>
+        </w:rPr>
+        <w:t>Web version won't load</w:t>
+      </w:r>
+    </w:p>
+    <w:p>
+      <w:r>
+        <w:rPr>
+          <w:b w:val="0"/>
+        </w:rPr>
+        <w:t>Try refreshing the page. If on slow WiFi, switch to cellular for the initial load.</w:t>
       </w:r>
     </w:p>
     <w:p>

</xml_diff>